<commit_message>
vault backup: 2026-05-27 20:38:49
</commit_message>
<xml_diff>
--- a/IntroducaoAGestao/TrabalhoFinal/Relatorio.docx
+++ b/IntroducaoAGestao/TrabalhoFinal/Relatorio.docx
@@ -40,75 +40,69 @@
       </w:pPr>
     </w:p>
     <w:p>
-      <w:pPr>
-        <w:pStyle w:val="Heading2"/>
-      </w:pPr>
-      <w:r>
-        <w:rPr>
-          <w:b/>
-        </w:rPr>
-        <w:t xml:space="preserve">Informações Gerais da Empresa</w:t>
-      </w:r>
-    </w:p>
-    <w:p>
-      <w:r>
-        <w:t xml:space="preserve">Nome: MLC Infra</w:t>
-      </w:r>
-    </w:p>
-    <w:p>
-      <w:r>
-        <w:t xml:space="preserve">Endereço: Curitiba, Paraná, Brasil (sede corporativa)</w:t>
-      </w:r>
-    </w:p>
-    <w:p>
-      <w:r>
-        <w:t xml:space="preserve">Tipo de atividade econômica: Construção pesada e infraestrutura (rodovias, saneamento, hidrelétricas, linhas de transmissão)</w:t>
-      </w:r>
-    </w:p>
-    <w:p>
-      <w:r>
-        <w:t xml:space="preserve">Número de funcionários: aproximadamente 1.200</w:t>
-      </w:r>
-    </w:p>
-    <w:p>
-      <w:r>
-        <w:t xml:space="preserve">Tipo jurídico: Sociedade Anônima de capital fechado, parte do Grupo JMalucelli</w:t>
-      </w:r>
-    </w:p>
-    <w:p>
-      <w:r>
-        <w:t xml:space="preserve">Porte: construtora nacional de médio a grande porte</w:t>
-      </w:r>
-    </w:p>
-    <w:p>
-      <w:pPr>
-        <w:pStyle w:val="Heading2"/>
-      </w:pPr>
-      <w:r>
-        <w:rPr>
-          <w:b/>
-        </w:rPr>
-        <w:t xml:space="preserve">Dados da Entrevista</w:t>
-      </w:r>
-    </w:p>
-    <w:p>
-      <w:r>
-        <w:t xml:space="preserve">Nome do entrevistado: Ricardo Malucelli</w:t>
-      </w:r>
-    </w:p>
-    <w:p>
-      <w:r>
-        <w:t xml:space="preserve">Cargo/função: Diretor Executivo</w:t>
-      </w:r>
-    </w:p>
-    <w:p>
-      <w:r>
-        <w:t xml:space="preserve">Data da entrevista: 20 de maio de 2026</w:t>
-      </w:r>
-    </w:p>
-    <w:p>
-      <w:r>
-        <w:t xml:space="preserve">Duração: aproximadamente 42 minutos</w:t>
+      <w:r>
+        <w:rPr>
+          <w:b/>
+        </w:rPr>
+        <w:t>Informações Gerais da Empresa</w:t>
+      </w:r>
+    </w:p>
+    <w:p>
+      <w:r>
+        <w:t>Nome: MLC Infra</w:t>
+      </w:r>
+    </w:p>
+    <w:p>
+      <w:r>
+        <w:t>Endereço: Curitiba, Paraná, Brasil (sede corporativa)</w:t>
+      </w:r>
+    </w:p>
+    <w:p>
+      <w:r>
+        <w:t>Tipo de atividade econômica: Construção pesada e infraestrutura (rodovias, saneamento, hidrelétricas, linhas de transmissão)</w:t>
+      </w:r>
+    </w:p>
+    <w:p>
+      <w:r>
+        <w:t>Número de funcionários: aproximadamente 1.200</w:t>
+      </w:r>
+    </w:p>
+    <w:p>
+      <w:r>
+        <w:t>Tipo jurídico: Sociedade Anônima de capital fechado, parte do Grupo JMalucelli</w:t>
+      </w:r>
+    </w:p>
+    <w:p>
+      <w:r>
+        <w:t>Porte: construtora nacional de médio a grande porte</w:t>
+      </w:r>
+    </w:p>
+    <w:p>
+      <w:r>
+        <w:rPr>
+          <w:b/>
+        </w:rPr>
+        <w:t>Dados da Entrevista</w:t>
+      </w:r>
+    </w:p>
+    <w:p>
+      <w:r>
+        <w:t>Nome do entrevistado: Ricardo Malucelli</w:t>
+      </w:r>
+    </w:p>
+    <w:p>
+      <w:r>
+        <w:t>Cargo/função: Diretor Executivo</w:t>
+      </w:r>
+    </w:p>
+    <w:p>
+      <w:r>
+        <w:t>Data da entrevista: 20 de maio de 2026</w:t>
+      </w:r>
+    </w:p>
+    <w:p>
+      <w:r>
+        <w:t>Duração: aproximadamente 42 minutos</w:t>
       </w:r>
     </w:p>
     <w:p>
@@ -118,7 +112,7 @@
     </w:p>
     <w:p>
       <w:r>
-        <w:t xml:space="preserve">Questionário escrito complementar respondido em: 22 de maio de 2026</w:t>
+        <w:t>Questionário escrito complementar respondido em: 22 de maio de 2026</w:t>
       </w:r>
     </w:p>
     <w:p>
@@ -239,7 +233,11 @@
         <w:t>hidrelétricas</w:t>
       </w:r>
       <w:r>
-        <w:t>, aeroportuárias, portuárias e estradas. Apesar de servir ambos os setores, privado e público, o foco estratégico está nas concessões, especialmente contratos para novas rodovias concedidas. De acordo com o Rica</w:t>
+        <w:t xml:space="preserve">, aeroportuárias, portuárias e estradas. Apesar de servir </w:t>
+      </w:r>
+      <w:r>
+        <w:lastRenderedPageBreak/>
+        <w:t>ambos os setores, privado e público, o foco estratégico está nas concessões, especialmente contratos para novas rodovias concedidas. De acordo com o Rica</w:t>
       </w:r>
       <w:r>
         <w:t>r</w:t>
@@ -247,11 +245,9 @@
       <w:r>
         <w:t xml:space="preserve">do, o foco atual da empresa </w:t>
       </w:r>
-      <w:proofErr w:type="gramStart"/>
-      <w:r>
-        <w:t>eh</w:t>
-      </w:r>
-      <w:proofErr w:type="gramEnd"/>
+      <w:r>
+        <w:t>é</w:t>
+      </w:r>
       <w:r>
         <w:t xml:space="preserve"> de conseguir contratos grandes, entre 700</w:t>
       </w:r>
@@ -403,7 +399,6 @@
           <w:b/>
           <w:bCs/>
         </w:rPr>
-        <w:lastRenderedPageBreak/>
         <w:t>Setup:</w:t>
       </w:r>
       <w:r>
@@ -632,7 +627,11 @@
         <w:t xml:space="preserve"> Entre os fatores externos </w:t>
       </w:r>
       <w:r>
-        <w:t xml:space="preserve">que frequentemente ampliam o cronograma estão o licenciamento ambiental, as desapropriações dentro da faixa de domínio, o remanejamento de redes de utilidade pública (água, esgoto, energia elétrica etc.) e as dependências de interface com outras empreiteiras contratadas pelo mesmo cliente. </w:t>
+        <w:t xml:space="preserve">que frequentemente ampliam o cronograma </w:t>
+      </w:r>
+      <w:r>
+        <w:lastRenderedPageBreak/>
+        <w:t xml:space="preserve">estão o licenciamento ambiental, as desapropriações dentro da faixa de domínio, o remanejamento de redes de utilidade pública (água, esgoto, energia elétrica etc.) e as dependências de interface com outras empreiteiras contratadas pelo mesmo cliente. </w:t>
       </w:r>
     </w:p>
     <w:p>
@@ -650,11 +649,9 @@
       <w:r>
         <w:t xml:space="preserve"> entrega 100% de seus contratos e obras dentro do prazo quando os fatores externos são excluídos. </w:t>
       </w:r>
-      <w:proofErr w:type="gramStart"/>
-      <w:r>
-        <w:t>Alterações  de</w:t>
-      </w:r>
-      <w:proofErr w:type="gramEnd"/>
+      <w:r>
+        <w:t>Alterações de</w:t>
+      </w:r>
       <w:r>
         <w:t xml:space="preserve"> escopo são comuns no setor e são formalmente acomodadas por meio de aditivos contratuais, com ajustes negociados de preço e prazo com base na planilha original de quantitativos. </w:t>
       </w:r>
@@ -700,7 +697,6 @@
           <w:b/>
           <w:bCs/>
         </w:rPr>
-        <w:lastRenderedPageBreak/>
         <w:t xml:space="preserve">Diesel (maior despesa): </w:t>
       </w:r>
       <w:r>
@@ -795,13 +791,14 @@
           <w:bCs/>
         </w:rPr>
         <w:tab/>
-        <w:t xml:space="preserve">A força de trabalho da empresa é organizada em dois principais grupos, claramente distintos: corporativo e campo. A sede em Curitiba, conhecida internamente como Escritório Central, concentra a alta liderança, a coordenação de engenharia, as áreas comerciais, de suprimentos, equipamentos, jurídico, recursos humanos e segurança. As operações de campo são estruturadas ao redor de cada obra, com uma hierarquia liderada pelo Gerente de Contrato e apoiada por engenheiros de produção, de planejamento, segurança, uma equipe administrativa e operadores de máquinas especializados. </w:t>
-      </w:r>
-      <w:r/>
-      <w:proofErr w:type="gramStart"/>
-      <w:r/>
-      <w:proofErr w:type="gramEnd"/>
-      <w:r/>
+      </w:r>
+      <w:r>
+        <w:t xml:space="preserve">A força de trabalho da empresa é organizada em dois principais grupos, claramente distintos: corporativo e campo. A sede em Curitiba, conhecida </w:t>
+      </w:r>
+      <w:r>
+        <w:lastRenderedPageBreak/>
+        <w:t xml:space="preserve">internamente como Escritório Central, concentra a alta liderança, a coordenação de engenharia, as áreas comerciais, de suprimentos, equipamentos, jurídico, recursos humanos e segurança. As operações de campo são estruturadas ao redor de cada obra, com uma hierarquia liderada pelo Gerente de Contrato e apoiada por engenheiros de produção, de planejamento, segurança, uma equipe administrativa e operadores de máquinas especializados. </w:t>
+      </w:r>
     </w:p>
     <w:p>
       <w:r>
@@ -812,12 +809,14 @@
     <w:p>
       <w:r>
         <w:tab/>
-        <w:t>Uma característica cultural e operacional relevante é o baixíssimo turnover no nível corporativo, com tempo médio de permanência de aproximadamente 12 anos. O entrevistado resumiu essa dinâmica em uma frase que captura a relação da empresa com suas pessoas: “quem fica veste a camisa; quem sai, logo volta”.</w:t>
-      </w:r>
-    </w:p>
-    <w:p>
-      <w:r>
-        <w:lastRenderedPageBreak/>
+        <w:t>Uma característica cultural e operacional relevante é o baixíssimo turnover no nível corporativo, com tempo médio de permanência de aproximadamente 12 anos. O entrevistado resumiu essa dinâmica em uma frase que captura a relação da empresa com suas pessoas: “quem fica veste a camisa</w:t>
+      </w:r>
+      <w:r>
+        <w:t>”</w:t>
+      </w:r>
+    </w:p>
+    <w:p>
+      <w:r>
         <w:tab/>
         <w:t xml:space="preserve">As equipes de campo, pela natureza temporária dos canteiros de obra, são mais móveis, mas a empresa atua ativamente para reter e transferir para novos projetos os melhores times administrativos, técnicos e de operadores. </w:t>
       </w:r>
@@ -867,7 +866,11 @@
         <w:tab/>
       </w:r>
       <w:r>
-        <w:t xml:space="preserve">As quatro funções administrativas clássicas formuladas por Henri Fayol, em 1916 (planejar, organizar, dirigir e controlar), foram investigadas explicitamente durante a entrevista. A prática da empresa se </w:t>
+        <w:t xml:space="preserve">As quatro funções administrativas clássicas formuladas por Henri Fayol, em 1916 (planejar, organizar, dirigir e controlar), foram investigadas explicitamente </w:t>
+      </w:r>
+      <w:r>
+        <w:lastRenderedPageBreak/>
+        <w:t xml:space="preserve">durante a entrevista. A prática da empresa se </w:t>
       </w:r>
       <w:r>
         <w:t>encaixa</w:t>
@@ -950,39 +953,39 @@
         <w:t>c</w:t>
       </w:r>
       <w:r>
-        <w:t xml:space="preserve">omercial. Abaixo desse nível estão os gerentes de </w:t>
+        <w:t xml:space="preserve">omercial. Abaixo desse nível estão os gerentes de área (administrativo, jurídico, segurança, comercial e orçamento). Os canteiros de obra, por sua vez, são organizados como unidades semiautônomas, cada uma com seu próprio </w:t>
+      </w:r>
+      <w:r>
+        <w:t>g</w:t>
+      </w:r>
+      <w:r>
+        <w:t>erente de</w:t>
+      </w:r>
+      <w:r>
+        <w:t xml:space="preserve"> c</w:t>
+      </w:r>
+      <w:r>
+        <w:t>ontrato e estrutura operacional completa. Essa divisão permite que o centro corporativo se concentre na governança e no suporte em nível de portfólio, ao mesmo tempo que dá autonomia à liderança local para tomar decisões no campo, uma aplicação típica do princípio da descentralização.</w:t>
+      </w:r>
+    </w:p>
+    <w:p>
+      <w:r>
+        <w:tab/>
+      </w:r>
+      <w:r>
+        <w:t>A direção é caracterizada pelo que Ricardo chamou de “gestão ativa”: uma cultura na qual todos, do dono ao trabalhador que segura a bandeira no canteiro, devem cumprir seu papel sobre a base de um plano bem definido. A empresa valoriza a agilidade na tomada de decisão como um diferencial competitivo central. O estilo de liderança é descrito como formal, disciplinado e conservador, coerente com o perfil analítico de sua força de trabalho composta majoritariamente por engenheiros.</w:t>
+      </w:r>
+    </w:p>
+    <w:p>
+      <w:r>
+        <w:tab/>
+      </w:r>
+      <w:r>
+        <w:t xml:space="preserve">O controle ocorre por meio de relatórios executivos mensais formais, preparados por cada obra, que consolidam indicadores de produção, custo e qualidade. A liderança corporativa se reúne mensalmente com as equipes de campo para revisar variações em relação ao orçamento. Estouros de custo geram ação corretiva imediata. Quando os preços de insumos sobem de maneira acentuada (como ocorreu com o diesel durante o choque geopolítico recente, quando o preço passou de R$ 5,80 para R$ 7,80 por litro), a empresa quantifica imediatamente o impacto e comunica formalmente os clientes. A companhia também mantém um Sistema de Gestão da Qualidade alinhado à ISO 9001, com indicadores formais de satisfação do cliente, infrações regulatórias, frequência e </w:t>
       </w:r>
       <w:r>
         <w:lastRenderedPageBreak/>
-        <w:t xml:space="preserve">área (administrativo, jurídico, segurança, comercial e orçamento). Os canteiros de obra, por sua vez, são organizados como unidades semiautônomas, cada uma com seu próprio </w:t>
-      </w:r>
-      <w:r>
-        <w:t>g</w:t>
-      </w:r>
-      <w:r>
-        <w:t>erente de</w:t>
-      </w:r>
-      <w:r>
-        <w:t xml:space="preserve"> c</w:t>
-      </w:r>
-      <w:r>
-        <w:t>ontrato e estrutura operacional completa. Essa divisão permite que o centro corporativo se concentre na governança e no suporte em nível de portfólio, ao mesmo tempo que dá autonomia à liderança local para tomar decisões no campo, uma aplicação típica do princípio da descentralização.</w:t>
-      </w:r>
-    </w:p>
-    <w:p>
-      <w:r>
-        <w:tab/>
-      </w:r>
-      <w:r>
-        <w:t>A direção é caracterizada pelo que Ricardo chamou de “gestão ativa”: uma cultura na qual todos, do dono ao trabalhador que segura a bandeira no canteiro, devem cumprir seu papel sobre a base de um plano bem definido. A empresa valoriza a agilidade na tomada de decisão como um diferencial competitivo central. O estilo de liderança é descrito como formal, disciplinado e conservador, coerente com o perfil analítico de sua força de trabalho composta majoritariamente por engenheiros.</w:t>
-      </w:r>
-    </w:p>
-    <w:p>
-      <w:r>
-        <w:tab/>
-      </w:r>
-      <w:r>
-        <w:t>O controle ocorre por meio de relatórios executivos mensais formais, preparados por cada obra, que consolidam indicadores de produção, custo e qualidade. A liderança corporativa se reúne mensalmente com as equipes de campo para revisar variações em relação ao orçamento. Estouros de custo geram ação corretiva imediata. Quando os preços de insumos sobem de maneira acentuada (como ocorreu com o diesel durante o choque geopolítico recente, quando o preço passou de R$ 5,80 para R$ 7,80 por litro), a empresa quantifica imediatamente o impacto e comunica formalmente os clientes. A companhia também mantém um Sistema de Gestão da Qualidade alinhado à ISO 9001, com indicadores formais de satisfação do cliente, infrações regulatórias, frequência e gravidade de acidentes, emissões, cumprimento de cronograma e rentabilidade por serviço.</w:t>
+        <w:t>gravidade de acidentes, emissões, cumprimento de cronograma e rentabilidade por serviço.</w:t>
       </w:r>
     </w:p>
     <w:p/>
@@ -1072,7 +1075,6 @@
           <w:b/>
           <w:bCs/>
         </w:rPr>
-        <w:lastRenderedPageBreak/>
         <w:t>Qualidade e Orgulho:</w:t>
       </w:r>
       <w:r>
@@ -1108,24 +1110,22 @@
     </w:p>
     <w:p/>
     <w:p>
-      <w:pPr>
-        <w:pStyle w:val="Heading2"/>
-      </w:pPr>
-      <w:r>
-        <w:rPr>
-          <w:b/>
-        </w:rPr>
-        <w:t xml:space="preserve">Observações Complementares</w:t>
-      </w:r>
-    </w:p>
-    <w:p>
-      <w:r>
-        <w:t xml:space="preserve">Embora a entrevista tenha sido realizada de forma remota, impossibilitando a observação direta do ambiente físico, a partir do relato detalhado do entrevistado é possível inferir características relevantes do ambiente organizacional, da dinâmica da equipe e do clima da empresa. O escritório central em Curitiba opera como um ambiente formal, com camadas hierárquicas bem definidas e rituais de gestão estruturados em torno de relatórios mensais e dashboards do ERP corporativo. A dinâmica entre matriz e canteiros é mediada por reuniões periódicas, comunicação técnica e padronização documental, refletindo o perfil analítico de uma força de trabalho composta majoritariamente por engenheiros civis.</w:t>
-      </w:r>
-    </w:p>
-    <w:p>
-      <w:r>
-        <w:t xml:space="preserve">O clima percebido ao longo da conversa foi de uma cultura disciplinada, técnica e conservadora, em que a tradição, a credibilidade e a postura profissional aparecem como traços dominantes. O entrevistado demonstrou abertura para discutir desafios reais da operação, autocrítica em relação a limitações tecnológicas e clara valorização da história do grupo, traços que se traduzem na alta retenção corporativa e na linguagem usada para descrever a “gestão ativa” da firma.</w:t>
+      <w:r>
+        <w:rPr>
+          <w:b/>
+        </w:rPr>
+        <w:t>Observações Complementares</w:t>
+      </w:r>
+    </w:p>
+    <w:p>
+      <w:r>
+        <w:t>Embora a entrevista tenha sido realizada de forma remota, impossibilitando a observação direta do ambiente físico, a partir do relato detalhado do entrevistado é possível inferir características relevantes do ambiente organizacional, da dinâmica da equipe e do clima da empresa. O escritório central em Curitiba opera como um ambiente formal, com camadas hierárquicas bem definidas e rituais de gestão estruturados em torno de relatórios mensais e dashboards do ERP corporativo. A dinâmica entre matriz e canteiros é mediada por reuniões periódicas, comunicação técnica e padronização documental, refletindo o perfil analítico de uma força de trabalho composta majoritariamente por engenheiros civis.</w:t>
+      </w:r>
+    </w:p>
+    <w:p>
+      <w:r>
+        <w:lastRenderedPageBreak/>
+        <w:t>O clima percebido ao longo da conversa foi de uma cultura disciplinada, técnica e conservadora, em que a tradição, a credibilidade e a postura profissional aparecem como traços dominantes. O entrevistado demonstrou abertura para discutir desafios reais da operação, autocrítica em relação a limitações tecnológicas e clara valorização da história do grupo, traços que se traduzem na alta retenção corporativa e na linguagem usada para descrever a “gestão ativa” da firma.</w:t>
       </w:r>
     </w:p>
     <w:p>
@@ -1237,24 +1237,6 @@
         <w:ind w:firstLine="708"/>
       </w:pPr>
       <w:r>
-        <w:t>Uma observação autocrítica do entrevistado merece destaque: ele afirmou abertamente que a empresa está atrás de concorrentes na adoção de novas tecnologias e procedimentos operacionais. Isso é coerente com o perfil cultural conservador e representa uma vulnerabilidade estratégica em um setor no qual concorrentes vêm experimentando cada vez mais BIM, monitoramento de obras baseado em IA e equipamentos automatizados.</w:t>
-      </w:r>
-      <w:r/>
-      <w:proofErr w:type="spellStart"/>
-      <w:r/>
-      <w:proofErr w:type="spellEnd"/>
-      <w:r/>
-      <w:proofErr w:type="spellStart"/>
-      <w:r/>
-      <w:proofErr w:type="spellEnd"/>
-      <w:r/>
-      <w:r/>
-    </w:p>
-    <w:p>
-      <w:pPr>
-        <w:ind w:firstLine="708"/>
-      </w:pPr>
-      <w:r>
         <w:t>As prioridades estratégicas futuras incluem conquistar grandes contratos (acima de R$ 700 a 800 milhões) em rodovias, ferrovias, portos e aeroportos, manter a parceria próxima com concessionárias no Paraná e expandir o portfólio de concessões por meio do consórcio formado por quatro construtoras e seu braço financeiro.</w:t>
       </w:r>
     </w:p>
@@ -1270,7 +1252,6 @@
           <w:b/>
           <w:bCs/>
         </w:rPr>
-        <w:lastRenderedPageBreak/>
         <w:t>ESG e Sustentabilidade:</w:t>
       </w:r>
     </w:p>
@@ -1327,6 +1308,7 @@
           <w:b/>
           <w:bCs/>
         </w:rPr>
+        <w:lastRenderedPageBreak/>
         <w:t xml:space="preserve">ODS 8: </w:t>
       </w:r>
       <w:r>
@@ -1441,11 +1423,43 @@
       </w:r>
       <w:proofErr w:type="spellEnd"/>
       <w:r>
-        <w:t xml:space="preserve"> e aos Estudos de Hawthorne, encontra eco na ênfase da empresa em retenção, no tempo médio de </w:t>
+        <w:t xml:space="preserve"> e aos Estudos de Hawthorne, encontra eco na ênfase da empresa em retenção, no tempo médio de permanência de 12 anos no nível corporativo e na narrativa cultural de “vestir a camisa”. A gestão ativa, conforme descrita por Ricardo, é coerente com a compreensão pós-Hawthorne de que a presença da liderança e o reconhecimento simbólico do esforço importam tanto quanto o controle formal.</w:t>
+      </w:r>
+    </w:p>
+    <w:p>
+      <w:pPr>
+        <w:ind w:firstLine="708"/>
+      </w:pPr>
+      <w:r>
+        <w:t>Por fim, a teoria dos stakeholders (Freeman, 1984) se reflete na amplitude do mapa de partes interessadas da empresa e no reconhecimento explícito de sindicatos, reguladores, comunidades e usuários finais como grupos críticos que exigem gestão ativa.</w:t>
+      </w:r>
+    </w:p>
+    <w:p/>
+    <w:p>
+      <w:pPr>
+        <w:rPr>
+          <w:b/>
+          <w:bCs/>
+        </w:rPr>
+      </w:pPr>
+      <w:r>
+        <w:rPr>
+          <w:b/>
+          <w:bCs/>
+        </w:rPr>
+        <w:t>Conclusão:</w:t>
+      </w:r>
+    </w:p>
+    <w:p>
+      <w:r>
+        <w:tab/>
+      </w:r>
+      <w:r>
+        <w:t xml:space="preserve">A MLC Infra é uma empresa de construção pesada madura, tradicional e disciplinada, cuja posição competitiva se apoia na solidez financeira, na agilidade </w:t>
       </w:r>
       <w:r>
         <w:lastRenderedPageBreak/>
-        <w:t>permanência de 12 anos no nível corporativo e na narrativa cultural de “vestir a camisa”. A gestão ativa, conforme descrita por Ricardo, é coerente com a compreensão pós-Hawthorne de que a presença da liderança e o reconhecimento simbólico do esforço importam tanto quanto o controle formal.</w:t>
+        <w:t xml:space="preserve">decisória e na credibilidade institucional do Grupo JMalucelli. Sua prática administrativa ilustra uma implementação bastante clara das quatro funções de Fayol, adaptadas a um modelo de negócios baseado em projetos, no qual cada canteiro de obra opera como uma unidade semiautônoma sob rigorosa supervisão corporativa. </w:t>
       </w:r>
     </w:p>
     <w:p>
@@ -1453,7 +1467,15 @@
         <w:ind w:firstLine="708"/>
       </w:pPr>
       <w:r>
-        <w:t>Por fim, a teoria dos stakeholders (Freeman, 1984) se reflete na amplitude do mapa de partes interessadas da empresa e no reconhecimento explícito de sindicatos, reguladores, comunidades e usuários finais como grupos críticos que exigem gestão ativa.</w:t>
+        <w:t xml:space="preserve">As principais forças da empresa (disciplina operacional, baixo turnover e gestão robusta de stakeholders) são equilibradas por fragilidades reconhecidas pela própria organização, especialmente na adoção tecnológica. Seu perfil ESG, ancorado nos ODS 8, 10 e 16, reflete uma compreensão autêntica de sustentabilidade, impulsionada pela natureza da infraestrutura, e não uma narrativa ESG meramente orientada por marketing. </w:t>
+      </w:r>
+    </w:p>
+    <w:p>
+      <w:pPr>
+        <w:ind w:firstLine="708"/>
+      </w:pPr>
+      <w:r>
+        <w:t>Para um estudante de gestão do primeiro semestre, o caso oferece uma demonstração convincente de que a teoria clássica da administração continua altamente relevante em setores intensivos em capital e baseados em projetos, nos quais o rigor de planejar, organizar, dirigir e controlar segue determinando resultados competitivos.</w:t>
       </w:r>
     </w:p>
     <w:p/>
@@ -1469,46 +1491,6 @@
           <w:b/>
           <w:bCs/>
         </w:rPr>
-        <w:t>Conclusão:</w:t>
-      </w:r>
-    </w:p>
-    <w:p>
-      <w:r>
-        <w:tab/>
-      </w:r>
-      <w:r>
-        <w:t xml:space="preserve">A MLC Infra é uma empresa de construção pesada madura, tradicional e disciplinada, cuja posição competitiva se apoia na solidez financeira, na agilidade decisória e na credibilidade institucional do Grupo JMalucelli. Sua prática administrativa ilustra uma implementação bastante clara das quatro funções de Fayol, adaptadas a um modelo de negócios baseado em projetos, no qual cada canteiro de obra opera como uma unidade semiautônoma sob rigorosa supervisão corporativa. </w:t>
-      </w:r>
-    </w:p>
-    <w:p>
-      <w:pPr>
-        <w:ind w:firstLine="708"/>
-      </w:pPr>
-      <w:r>
-        <w:t xml:space="preserve">As principais forças da empresa (disciplina operacional, baixo turnover e gestão robusta de stakeholders) são equilibradas por fragilidades reconhecidas pela própria organização, especialmente na adoção tecnológica. Seu perfil ESG, ancorado nos ODS 8, 10 e 16, reflete uma compreensão autêntica de sustentabilidade, impulsionada pela natureza da infraestrutura, e não uma narrativa ESG meramente orientada por marketing. </w:t>
-      </w:r>
-    </w:p>
-    <w:p>
-      <w:pPr>
-        <w:ind w:firstLine="708"/>
-      </w:pPr>
-      <w:r>
-        <w:t>Para um estudante de gestão do primeiro semestre, o caso oferece uma demonstração convincente de que a teoria clássica da administração continua altamente relevante em setores intensivos em capital e baseados em projetos, nos quais o rigor de planejar, organizar, dirigir e controlar segue determinando resultados competitivos.</w:t>
-      </w:r>
-    </w:p>
-    <w:p/>
-    <w:p>
-      <w:pPr>
-        <w:rPr>
-          <w:b/>
-          <w:bCs/>
-        </w:rPr>
-      </w:pPr>
-      <w:r>
-        <w:rPr>
-          <w:b/>
-          <w:bCs/>
-        </w:rPr>
         <w:t>Registro d</w:t>
       </w:r>
       <w:r>
@@ -1530,8 +1512,8 @@
         <w:rPr>
           <w:b/>
           <w:bCs/>
-        </w:rPr>
-        <w:lastRenderedPageBreak/>
+          <w:noProof/>
+        </w:rPr>
         <w:drawing>
           <wp:inline distT="0" distB="0" distL="0" distR="0" wp14:anchorId="39930B14" wp14:editId="3A44ACF2">
             <wp:extent cx="5400040" cy="3392170"/>
@@ -2779,6 +2761,7 @@
   <w:style w:type="character" w:default="1" w:styleId="Fontepargpadro">
     <w:name w:val="Default Paragraph Font"/>
     <w:uiPriority w:val="1"/>
+    <w:semiHidden/>
     <w:unhideWhenUsed/>
   </w:style>
   <w:style w:type="table" w:default="1" w:styleId="Tabelanormal">

</xml_diff>